<commit_message>
Ideas sobre proyecto final
</commit_message>
<xml_diff>
--- a/Tarea.docx
+++ b/Tarea.docx
@@ -75,6 +75,145 @@
         </w:rPr>
         <w:t>El lunes trabajamos con ejemplos de sumatorias para entender mejor el tema y aclarar cualquier duda. Al final de la clase nos dejaron como tarea realizar una sumatoria grande y grabar el procedimiento para demostrar cómo la hicimos.</w:t>
       </w:r>
+    </w:p>
+    <w:p>
+      <w:pPr>
+        <w:rPr>
+          <w:rFonts w:hint="default"/>
+          <w:sz w:val="28"/>
+          <w:szCs w:val="28"/>
+        </w:rPr>
+      </w:pPr>
+    </w:p>
+    <w:p>
+      <w:pPr>
+        <w:rPr>
+          <w:rFonts w:hint="default"/>
+          <w:sz w:val="28"/>
+          <w:szCs w:val="28"/>
+        </w:rPr>
+      </w:pPr>
+      <w:r>
+        <w:rPr>
+          <w:rFonts w:hint="default"/>
+          <w:sz w:val="28"/>
+          <w:szCs w:val="28"/>
+        </w:rPr>
+        <w:t>Pensando en Nuestro Proyecto Final</w:t>
+      </w:r>
+    </w:p>
+    <w:p>
+      <w:pPr>
+        <w:rPr>
+          <w:rFonts w:hint="default"/>
+          <w:sz w:val="28"/>
+          <w:szCs w:val="28"/>
+        </w:rPr>
+      </w:pPr>
+    </w:p>
+    <w:p>
+      <w:pPr>
+        <w:rPr>
+          <w:rFonts w:hint="default"/>
+          <w:sz w:val="28"/>
+          <w:szCs w:val="28"/>
+        </w:rPr>
+      </w:pPr>
+      <w:r>
+        <w:rPr>
+          <w:rFonts w:hint="default"/>
+          <w:sz w:val="28"/>
+          <w:szCs w:val="28"/>
+          <w:lang w:val="es-MX"/>
+        </w:rPr>
+        <w:t>El</w:t>
+      </w:r>
+      <w:r>
+        <w:rPr>
+          <w:rFonts w:hint="default"/>
+          <w:sz w:val="28"/>
+          <w:szCs w:val="28"/>
+        </w:rPr>
+        <w:t xml:space="preserve"> día</w:t>
+      </w:r>
+      <w:r>
+        <w:rPr>
+          <w:rFonts w:hint="default"/>
+          <w:sz w:val="28"/>
+          <w:szCs w:val="28"/>
+          <w:lang w:val="es-MX"/>
+        </w:rPr>
+        <w:t xml:space="preserve"> martes</w:t>
+      </w:r>
+      <w:r>
+        <w:rPr>
+          <w:rFonts w:hint="default"/>
+          <w:sz w:val="28"/>
+          <w:szCs w:val="28"/>
+        </w:rPr>
+        <w:t xml:space="preserve"> estuvimos pensando en qué proyecto final queríamos realizar. La actividad consistió en plantear diferentes ideas y comenzar a imaginar cómo sería nuestro proyecto y qué podríamos hacer para llevarlo a cabo.</w:t>
+      </w:r>
+    </w:p>
+    <w:p>
+      <w:pPr>
+        <w:rPr>
+          <w:rFonts w:hint="default"/>
+          <w:sz w:val="28"/>
+          <w:szCs w:val="28"/>
+        </w:rPr>
+      </w:pPr>
+    </w:p>
+    <w:p>
+      <w:pPr>
+        <w:rPr>
+          <w:rFonts w:hint="default"/>
+          <w:sz w:val="28"/>
+          <w:szCs w:val="28"/>
+        </w:rPr>
+      </w:pPr>
+      <w:r>
+        <w:rPr>
+          <w:rFonts w:hint="default"/>
+          <w:sz w:val="28"/>
+          <w:szCs w:val="28"/>
+        </w:rPr>
+        <w:t>Formando el Equipo y Eligiendo el Proyecto</w:t>
+      </w:r>
+    </w:p>
+    <w:p>
+      <w:pPr>
+        <w:rPr>
+          <w:rFonts w:hint="default"/>
+          <w:sz w:val="28"/>
+          <w:szCs w:val="28"/>
+        </w:rPr>
+      </w:pPr>
+    </w:p>
+    <w:p>
+      <w:pPr>
+        <w:rPr>
+          <w:rFonts w:hint="default"/>
+          <w:sz w:val="28"/>
+          <w:szCs w:val="28"/>
+        </w:rPr>
+      </w:pPr>
+      <w:r>
+        <w:rPr>
+          <w:rFonts w:hint="default"/>
+          <w:sz w:val="28"/>
+          <w:szCs w:val="28"/>
+        </w:rPr>
+        <w:t>El tercer día formamos equipos de tres personas para trabajar en el proyecto final. Después de organizarnos, cada integrante propuso su idea y tuvimos que seleccionar un solo proyecto entre los que habíamos pensado para trabajar todos juntos.</w:t>
+      </w:r>
+    </w:p>
+    <w:p>
+      <w:pPr>
+        <w:rPr>
+          <w:rFonts w:hint="default"/>
+          <w:sz w:val="28"/>
+          <w:szCs w:val="28"/>
+        </w:rPr>
+      </w:pPr>
       <w:bookmarkStart w:id="0" w:name="_GoBack"/>
       <w:bookmarkEnd w:id="0"/>
     </w:p>

</xml_diff>